<commit_message>
Update MODELO PRINCIPAL with corrected version - all markers verified
</commit_message>
<xml_diff>
--- a/Modelo Principal/MODELO PRINCIPAL.docx
+++ b/Modelo Principal/MODELO PRINCIPAL.docx
@@ -17,55 +17,13 @@
         <w:jc w:val="both"/>
         <w:rPr>
           <w:rFonts w:ascii="Barlow" w:eastAsia="Barlow" w:hAnsi="Barlow" w:cs="Barlow"/>
-          <w:color w:val="000000" w:themeColor="text1"/>
-          <w:sz w:val="22"/>
-          <w:szCs w:val="22"/>
-        </w:rPr>
-      </w:pPr>
-      <w:r>
-        <w:rPr>
-          <w:rFonts w:ascii="Barlow" w:eastAsia="Barlow" w:hAnsi="Barlow" w:cs="Barlow"/>
-          <w:color w:val="000000" w:themeColor="text1"/>
-          <w:sz w:val="22"/>
-          <w:szCs w:val="22"/>
-          <w:lang w:val="es-ES"/>
-        </w:rPr>
-        <w:t>[FECHA]</w:t>
-      </w:r>
-      <w:r>
-        <w:rPr>
-          <w:rFonts w:ascii="Barlow" w:eastAsia="Barlow" w:hAnsi="Barlow" w:cs="Barlow"/>
-          <w:color w:val="000000" w:themeColor="text1"/>
-          <w:sz w:val="22"/>
-          <w:szCs w:val="22"/>
-          <w:lang w:val="es-ES"/>
-        </w:rPr>
-        <w:t xml:space="preserve">                      </w:t>
-      </w:r>
-      <w:proofErr w:type="gramStart"/>
-      <w:r>
-        <w:rPr>
-          <w:rFonts w:ascii="Barlow" w:eastAsia="Barlow" w:hAnsi="Barlow" w:cs="Barlow"/>
-          <w:color w:val="000000" w:themeColor="text1"/>
-          <w:sz w:val="22"/>
-          <w:szCs w:val="22"/>
-          <w:lang w:val="es-ES"/>
-        </w:rPr>
-        <w:t xml:space="preserve">   </w:t>
-      </w:r>
-      <w:r>
-        <w:rPr>
-          <w:rFonts w:ascii="Barlow" w:eastAsia="Barlow" w:hAnsi="Barlow" w:cs="Barlow"/>
           <w:b/>
           <w:bCs/>
           <w:color w:val="000000" w:themeColor="text1"/>
           <w:sz w:val="22"/>
           <w:szCs w:val="22"/>
-          <w:lang w:val="es-ES"/>
-        </w:rPr>
-        <w:t>[</w:t>
-      </w:r>
-      <w:proofErr w:type="gramEnd"/>
+        </w:rPr>
+      </w:pPr>
       <w:r>
         <w:rPr>
           <w:rFonts w:ascii="Barlow" w:eastAsia="Barlow" w:hAnsi="Barlow" w:cs="Barlow"/>
@@ -76,24 +34,9 @@
           <w:szCs w:val="22"/>
           <w:lang w:val="es-ES"/>
         </w:rPr>
-        <w:t>RADICADO DE SALIDA]</w:t>
-      </w:r>
-    </w:p>
-    <w:p>
-      <w:pPr>
-        <w:jc w:val="both"/>
-        <w:rPr>
-          <w:rFonts w:ascii="Barlow" w:eastAsia="Barlow" w:hAnsi="Barlow" w:cs="Barlow"/>
-          <w:color w:val="000000" w:themeColor="text1"/>
-          <w:sz w:val="22"/>
-          <w:szCs w:val="22"/>
-        </w:rPr>
-      </w:pPr>
-    </w:p>
-    <w:p>
-      <w:pPr>
-        <w:pStyle w:val="Ttulo1"/>
-        <w:jc w:val="both"/>
+        <w:t>[FECHA]</w:t>
+      </w:r>
+      <w:r>
         <w:rPr>
           <w:rFonts w:ascii="Barlow" w:eastAsia="Barlow" w:hAnsi="Barlow" w:cs="Barlow"/>
           <w:b/>
@@ -101,29 +44,11 @@
           <w:color w:val="000000" w:themeColor="text1"/>
           <w:sz w:val="22"/>
           <w:szCs w:val="22"/>
-        </w:rPr>
-      </w:pPr>
-      <w:r>
-        <w:rPr>
-          <w:rFonts w:ascii="Barlow" w:eastAsia="Barlow" w:hAnsi="Barlow" w:cs="Barlow"/>
-          <w:color w:val="000000" w:themeColor="text1"/>
-          <w:sz w:val="22"/>
-          <w:szCs w:val="22"/>
-          <w:lang w:val="es-ES"/>
-        </w:rPr>
-        <w:t xml:space="preserve">Señores </w:t>
-      </w:r>
-    </w:p>
-    <w:p>
-      <w:pPr>
-        <w:jc w:val="both"/>
-        <w:rPr>
-          <w:rFonts w:ascii="Barlow" w:eastAsia="Barlow" w:hAnsi="Barlow" w:cs="Barlow"/>
-          <w:color w:val="000000" w:themeColor="text1"/>
-          <w:sz w:val="22"/>
-          <w:szCs w:val="22"/>
-        </w:rPr>
-      </w:pPr>
+          <w:lang w:val="es-ES"/>
+        </w:rPr>
+        <w:t xml:space="preserve">                      </w:t>
+      </w:r>
+      <w:proofErr w:type="gramStart"/>
       <w:r>
         <w:rPr>
           <w:rFonts w:ascii="Barlow" w:eastAsia="Barlow" w:hAnsi="Barlow" w:cs="Barlow"/>
@@ -134,9 +59,8 @@
           <w:szCs w:val="22"/>
           <w:lang w:val="es-ES"/>
         </w:rPr>
-        <w:t>[</w:t>
-      </w:r>
-      <w:proofErr w:type="gramStart"/>
+        <w:t xml:space="preserve">   </w:t>
+      </w:r>
       <w:r>
         <w:rPr>
           <w:rFonts w:ascii="Barlow" w:eastAsia="Barlow" w:hAnsi="Barlow" w:cs="Barlow"/>
@@ -147,8 +71,9 @@
           <w:szCs w:val="22"/>
           <w:lang w:val="es-ES"/>
         </w:rPr>
-        <w:t xml:space="preserve">JUZGADO </w:t>
-      </w:r>
+        <w:t>[</w:t>
+      </w:r>
+      <w:proofErr w:type="gramEnd"/>
       <w:r>
         <w:rPr>
           <w:rFonts w:ascii="Barlow" w:eastAsia="Barlow" w:hAnsi="Barlow" w:cs="Barlow"/>
@@ -159,101 +84,24 @@
           <w:szCs w:val="22"/>
           <w:lang w:val="es-ES"/>
         </w:rPr>
-        <w:t>]</w:t>
-      </w:r>
-      <w:proofErr w:type="gramEnd"/>
-    </w:p>
-    <w:p>
-      <w:pPr>
-        <w:jc w:val="both"/>
-        <w:rPr>
-          <w:rFonts w:ascii="Barlow" w:eastAsia="Barlow" w:hAnsi="Barlow" w:cs="Barlow"/>
-          <w:color w:val="000000" w:themeColor="text1"/>
-          <w:sz w:val="22"/>
-          <w:szCs w:val="22"/>
-        </w:rPr>
-      </w:pPr>
-      <w:r>
-        <w:rPr>
-          <w:rFonts w:ascii="Barlow" w:eastAsia="Barlow" w:hAnsi="Barlow" w:cs="Barlow"/>
-          <w:color w:val="000000" w:themeColor="text1"/>
-          <w:sz w:val="22"/>
-          <w:szCs w:val="22"/>
-          <w:lang w:val="es-ES"/>
-        </w:rPr>
-        <w:t>E.</w:t>
-      </w:r>
-      <w:r>
-        <w:rPr>
-          <w:rFonts w:ascii="Barlow" w:hAnsi="Barlow"/>
-          <w:sz w:val="22"/>
-          <w:szCs w:val="22"/>
-        </w:rPr>
-        <w:tab/>
-      </w:r>
-      <w:r>
-        <w:rPr>
-          <w:rFonts w:ascii="Barlow" w:eastAsia="Barlow" w:hAnsi="Barlow" w:cs="Barlow"/>
-          <w:color w:val="000000" w:themeColor="text1"/>
-          <w:sz w:val="22"/>
-          <w:szCs w:val="22"/>
-          <w:lang w:val="es-ES"/>
-        </w:rPr>
-        <w:t>S.</w:t>
-      </w:r>
-      <w:r>
-        <w:rPr>
-          <w:rFonts w:ascii="Barlow" w:hAnsi="Barlow"/>
-          <w:sz w:val="22"/>
-          <w:szCs w:val="22"/>
-        </w:rPr>
-        <w:tab/>
-      </w:r>
-      <w:r>
-        <w:rPr>
-          <w:rFonts w:ascii="Barlow" w:eastAsia="Barlow" w:hAnsi="Barlow" w:cs="Barlow"/>
-          <w:color w:val="000000" w:themeColor="text1"/>
-          <w:sz w:val="22"/>
-          <w:szCs w:val="22"/>
-          <w:lang w:val="es-ES"/>
-        </w:rPr>
-        <w:t>D.</w:t>
-      </w:r>
-    </w:p>
-    <w:p>
-      <w:pPr>
-        <w:jc w:val="both"/>
-        <w:rPr>
-          <w:rFonts w:ascii="Barlow" w:eastAsia="Barlow" w:hAnsi="Barlow" w:cs="Barlow"/>
-          <w:color w:val="000000" w:themeColor="text1"/>
-          <w:sz w:val="22"/>
-          <w:szCs w:val="22"/>
-        </w:rPr>
-      </w:pPr>
-    </w:p>
-    <w:p>
-      <w:pPr>
-        <w:jc w:val="both"/>
-        <w:rPr>
-          <w:rFonts w:ascii="Barlow" w:eastAsia="Barlow" w:hAnsi="Barlow" w:cs="Barlow"/>
-          <w:color w:val="000000" w:themeColor="text1"/>
-          <w:sz w:val="22"/>
-          <w:szCs w:val="22"/>
-        </w:rPr>
-      </w:pPr>
-    </w:p>
-    <w:p>
-      <w:pPr>
-        <w:ind w:left="1985" w:hanging="1701"/>
-        <w:jc w:val="both"/>
-        <w:rPr>
-          <w:rFonts w:ascii="Barlow" w:eastAsia="Barlow" w:hAnsi="Barlow" w:cs="Barlow"/>
-          <w:color w:val="000000" w:themeColor="text1"/>
-          <w:sz w:val="22"/>
-          <w:szCs w:val="22"/>
-        </w:rPr>
-      </w:pPr>
-      <w:r>
+        <w:t>RADICADO DE SALIDA]</w:t>
+      </w:r>
+    </w:p>
+    <w:p>
+      <w:pPr>
+        <w:jc w:val="both"/>
+        <w:rPr>
+          <w:rFonts w:ascii="Barlow" w:eastAsia="Barlow" w:hAnsi="Barlow" w:cs="Barlow"/>
+          <w:color w:val="000000" w:themeColor="text1"/>
+          <w:sz w:val="22"/>
+          <w:szCs w:val="22"/>
+        </w:rPr>
+      </w:pPr>
+    </w:p>
+    <w:p>
+      <w:pPr>
+        <w:pStyle w:val="Ttulo1"/>
+        <w:jc w:val="both"/>
         <w:rPr>
           <w:rFonts w:ascii="Barlow" w:eastAsia="Barlow" w:hAnsi="Barlow" w:cs="Barlow"/>
           <w:b/>
@@ -261,42 +109,21 @@
           <w:color w:val="000000" w:themeColor="text1"/>
           <w:sz w:val="22"/>
           <w:szCs w:val="22"/>
-          <w:lang w:val="es-ES"/>
-        </w:rPr>
-        <w:t>REF.</w:t>
-      </w:r>
-      <w:r>
-        <w:rPr>
-          <w:rFonts w:ascii="Barlow" w:eastAsia="Barlow" w:hAnsi="Barlow" w:cs="Barlow"/>
-          <w:color w:val="000000" w:themeColor="text1"/>
-          <w:sz w:val="22"/>
-          <w:szCs w:val="22"/>
-          <w:lang w:val="es-ES"/>
-        </w:rPr>
-        <w:t xml:space="preserve"> </w:t>
-      </w:r>
-      <w:r>
-        <w:rPr>
-          <w:rFonts w:ascii="Barlow" w:hAnsi="Barlow"/>
-          <w:sz w:val="22"/>
-          <w:szCs w:val="22"/>
-        </w:rPr>
-        <w:tab/>
-      </w:r>
-      <w:r>
-        <w:rPr>
-          <w:rFonts w:ascii="Barlow" w:eastAsia="Barlow" w:hAnsi="Barlow" w:cs="Barlow"/>
-          <w:color w:val="000000" w:themeColor="text1"/>
-          <w:sz w:val="22"/>
-          <w:szCs w:val="22"/>
-          <w:lang w:val="es-ES"/>
-        </w:rPr>
-        <w:t>Contestación Acción de Tutela.</w:t>
-      </w:r>
-    </w:p>
-    <w:p>
-      <w:pPr>
-        <w:ind w:left="1985" w:hanging="1701"/>
+        </w:rPr>
+      </w:pPr>
+      <w:r>
+        <w:rPr>
+          <w:rFonts w:ascii="Barlow" w:eastAsia="Barlow" w:hAnsi="Barlow" w:cs="Barlow"/>
+          <w:color w:val="000000" w:themeColor="text1"/>
+          <w:sz w:val="22"/>
+          <w:szCs w:val="22"/>
+          <w:lang w:val="es-ES"/>
+        </w:rPr>
+        <w:t xml:space="preserve">Señores </w:t>
+      </w:r>
+    </w:p>
+    <w:p>
+      <w:pPr>
         <w:jc w:val="both"/>
         <w:rPr>
           <w:rFonts w:ascii="Barlow" w:eastAsia="Barlow" w:hAnsi="Barlow" w:cs="Barlow"/>
@@ -315,46 +142,9 @@
           <w:szCs w:val="22"/>
           <w:lang w:val="es-ES"/>
         </w:rPr>
-        <w:t>Accionante</w:t>
-      </w:r>
-      <w:r>
-        <w:rPr>
-          <w:rFonts w:ascii="Barlow" w:eastAsia="Barlow" w:hAnsi="Barlow" w:cs="Barlow"/>
-          <w:color w:val="000000" w:themeColor="text1"/>
-          <w:sz w:val="22"/>
-          <w:szCs w:val="22"/>
-          <w:lang w:val="es-ES"/>
-        </w:rPr>
-        <w:t>:</w:t>
-      </w:r>
-      <w:r>
-        <w:rPr>
-          <w:rFonts w:ascii="Barlow" w:hAnsi="Barlow"/>
-          <w:sz w:val="22"/>
-          <w:szCs w:val="22"/>
-        </w:rPr>
-        <w:tab/>
-      </w:r>
-      <w:r>
-        <w:rPr>
-          <w:rFonts w:ascii="Barlow" w:hAnsi="Barlow"/>
-          <w:sz w:val="22"/>
-          <w:szCs w:val="22"/>
-        </w:rPr>
-        <w:t>[ACCIONANTE]</w:t>
-      </w:r>
-    </w:p>
-    <w:p>
-      <w:pPr>
-        <w:ind w:left="1985" w:hanging="1701"/>
-        <w:jc w:val="both"/>
-        <w:rPr>
-          <w:rFonts w:ascii="Barlow" w:eastAsia="Barlow" w:hAnsi="Barlow" w:cs="Barlow"/>
-          <w:color w:val="000000" w:themeColor="text1"/>
-          <w:sz w:val="22"/>
-          <w:szCs w:val="22"/>
-        </w:rPr>
-      </w:pPr>
+        <w:t>[</w:t>
+      </w:r>
+      <w:proofErr w:type="gramStart"/>
       <w:r>
         <w:rPr>
           <w:rFonts w:ascii="Barlow" w:eastAsia="Barlow" w:hAnsi="Barlow" w:cs="Barlow"/>
@@ -365,38 +155,8 @@
           <w:szCs w:val="22"/>
           <w:lang w:val="es-ES"/>
         </w:rPr>
-        <w:t>Accionado:</w:t>
-      </w:r>
-      <w:r>
-        <w:rPr>
-          <w:rFonts w:ascii="Barlow" w:hAnsi="Barlow"/>
-          <w:sz w:val="22"/>
-          <w:szCs w:val="22"/>
-        </w:rPr>
-        <w:tab/>
-      </w:r>
-      <w:r>
-        <w:rPr>
-          <w:rFonts w:ascii="Barlow" w:eastAsia="Barlow" w:hAnsi="Barlow" w:cs="Barlow"/>
-          <w:color w:val="000000" w:themeColor="text1"/>
-          <w:sz w:val="22"/>
-          <w:szCs w:val="22"/>
-          <w:lang w:val="es-ES"/>
-        </w:rPr>
-        <w:t xml:space="preserve">EPS SURA - 8000887022 </w:t>
-      </w:r>
-    </w:p>
-    <w:p>
-      <w:pPr>
-        <w:ind w:left="1985" w:hanging="1701"/>
-        <w:jc w:val="both"/>
-        <w:rPr>
-          <w:rFonts w:ascii="Barlow" w:eastAsia="Barlow" w:hAnsi="Barlow" w:cs="Barlow"/>
-          <w:color w:val="000000" w:themeColor="text1"/>
-          <w:sz w:val="22"/>
-          <w:szCs w:val="22"/>
-        </w:rPr>
-      </w:pPr>
+        <w:t xml:space="preserve">JUZGADO </w:t>
+      </w:r>
       <w:r>
         <w:rPr>
           <w:rFonts w:ascii="Barlow" w:eastAsia="Barlow" w:hAnsi="Barlow" w:cs="Barlow"/>
@@ -407,6 +167,256 @@
           <w:szCs w:val="22"/>
           <w:lang w:val="es-ES"/>
         </w:rPr>
+        <w:t>]</w:t>
+      </w:r>
+      <w:proofErr w:type="gramEnd"/>
+    </w:p>
+    <w:p>
+      <w:pPr>
+        <w:jc w:val="both"/>
+        <w:rPr>
+          <w:rFonts w:ascii="Barlow" w:eastAsia="Barlow" w:hAnsi="Barlow" w:cs="Barlow"/>
+          <w:color w:val="000000" w:themeColor="text1"/>
+          <w:sz w:val="22"/>
+          <w:szCs w:val="22"/>
+        </w:rPr>
+      </w:pPr>
+      <w:r>
+        <w:rPr>
+          <w:rFonts w:ascii="Barlow" w:eastAsia="Barlow" w:hAnsi="Barlow" w:cs="Barlow"/>
+          <w:color w:val="000000" w:themeColor="text1"/>
+          <w:sz w:val="22"/>
+          <w:szCs w:val="22"/>
+          <w:lang w:val="es-ES"/>
+        </w:rPr>
+        <w:t>E.</w:t>
+      </w:r>
+      <w:r>
+        <w:rPr>
+          <w:rFonts w:ascii="Barlow" w:hAnsi="Barlow"/>
+          <w:sz w:val="22"/>
+          <w:szCs w:val="22"/>
+        </w:rPr>
+        <w:tab/>
+      </w:r>
+      <w:r>
+        <w:rPr>
+          <w:rFonts w:ascii="Barlow" w:eastAsia="Barlow" w:hAnsi="Barlow" w:cs="Barlow"/>
+          <w:color w:val="000000" w:themeColor="text1"/>
+          <w:sz w:val="22"/>
+          <w:szCs w:val="22"/>
+          <w:lang w:val="es-ES"/>
+        </w:rPr>
+        <w:t>S.</w:t>
+      </w:r>
+      <w:r>
+        <w:rPr>
+          <w:rFonts w:ascii="Barlow" w:hAnsi="Barlow"/>
+          <w:sz w:val="22"/>
+          <w:szCs w:val="22"/>
+        </w:rPr>
+        <w:tab/>
+      </w:r>
+      <w:r>
+        <w:rPr>
+          <w:rFonts w:ascii="Barlow" w:eastAsia="Barlow" w:hAnsi="Barlow" w:cs="Barlow"/>
+          <w:color w:val="000000" w:themeColor="text1"/>
+          <w:sz w:val="22"/>
+          <w:szCs w:val="22"/>
+          <w:lang w:val="es-ES"/>
+        </w:rPr>
+        <w:t>D.</w:t>
+      </w:r>
+    </w:p>
+    <w:p>
+      <w:pPr>
+        <w:jc w:val="both"/>
+        <w:rPr>
+          <w:rFonts w:ascii="Barlow" w:eastAsia="Barlow" w:hAnsi="Barlow" w:cs="Barlow"/>
+          <w:color w:val="000000" w:themeColor="text1"/>
+          <w:sz w:val="22"/>
+          <w:szCs w:val="22"/>
+        </w:rPr>
+      </w:pPr>
+    </w:p>
+    <w:p>
+      <w:pPr>
+        <w:jc w:val="both"/>
+        <w:rPr>
+          <w:rFonts w:ascii="Barlow" w:eastAsia="Barlow" w:hAnsi="Barlow" w:cs="Barlow"/>
+          <w:color w:val="000000" w:themeColor="text1"/>
+          <w:sz w:val="22"/>
+          <w:szCs w:val="22"/>
+        </w:rPr>
+      </w:pPr>
+    </w:p>
+    <w:p>
+      <w:pPr>
+        <w:ind w:left="1985" w:hanging="1701"/>
+        <w:jc w:val="both"/>
+        <w:rPr>
+          <w:rFonts w:ascii="Barlow" w:eastAsia="Barlow" w:hAnsi="Barlow" w:cs="Barlow"/>
+          <w:color w:val="000000" w:themeColor="text1"/>
+          <w:sz w:val="22"/>
+          <w:szCs w:val="22"/>
+        </w:rPr>
+      </w:pPr>
+      <w:r>
+        <w:rPr>
+          <w:rFonts w:ascii="Barlow" w:eastAsia="Barlow" w:hAnsi="Barlow" w:cs="Barlow"/>
+          <w:b/>
+          <w:bCs/>
+          <w:color w:val="000000" w:themeColor="text1"/>
+          <w:sz w:val="22"/>
+          <w:szCs w:val="22"/>
+          <w:lang w:val="es-ES"/>
+        </w:rPr>
+        <w:t>REF.</w:t>
+      </w:r>
+      <w:r>
+        <w:rPr>
+          <w:rFonts w:ascii="Barlow" w:eastAsia="Barlow" w:hAnsi="Barlow" w:cs="Barlow"/>
+          <w:color w:val="000000" w:themeColor="text1"/>
+          <w:sz w:val="22"/>
+          <w:szCs w:val="22"/>
+          <w:lang w:val="es-ES"/>
+        </w:rPr>
+        <w:t xml:space="preserve"> </w:t>
+      </w:r>
+      <w:r>
+        <w:rPr>
+          <w:rFonts w:ascii="Barlow" w:hAnsi="Barlow"/>
+          <w:sz w:val="22"/>
+          <w:szCs w:val="22"/>
+        </w:rPr>
+        <w:tab/>
+      </w:r>
+      <w:r>
+        <w:rPr>
+          <w:rFonts w:ascii="Barlow" w:eastAsia="Barlow" w:hAnsi="Barlow" w:cs="Barlow"/>
+          <w:color w:val="000000" w:themeColor="text1"/>
+          <w:sz w:val="22"/>
+          <w:szCs w:val="22"/>
+          <w:lang w:val="es-ES"/>
+        </w:rPr>
+        <w:t>Contestación Acción de Tutela.</w:t>
+      </w:r>
+    </w:p>
+    <w:p>
+      <w:pPr>
+        <w:ind w:left="1985" w:hanging="1701"/>
+        <w:jc w:val="both"/>
+        <w:rPr>
+          <w:rFonts w:ascii="Barlow" w:eastAsia="Barlow" w:hAnsi="Barlow" w:cs="Barlow"/>
+          <w:color w:val="000000" w:themeColor="text1"/>
+          <w:sz w:val="22"/>
+          <w:szCs w:val="22"/>
+        </w:rPr>
+      </w:pPr>
+      <w:r>
+        <w:rPr>
+          <w:rFonts w:ascii="Barlow" w:eastAsia="Barlow" w:hAnsi="Barlow" w:cs="Barlow"/>
+          <w:b/>
+          <w:bCs/>
+          <w:color w:val="000000" w:themeColor="text1"/>
+          <w:sz w:val="22"/>
+          <w:szCs w:val="22"/>
+          <w:lang w:val="es-ES"/>
+        </w:rPr>
+        <w:t>Accionante</w:t>
+      </w:r>
+      <w:r>
+        <w:rPr>
+          <w:rFonts w:ascii="Barlow" w:eastAsia="Barlow" w:hAnsi="Barlow" w:cs="Barlow"/>
+          <w:color w:val="000000" w:themeColor="text1"/>
+          <w:sz w:val="22"/>
+          <w:szCs w:val="22"/>
+          <w:lang w:val="es-ES"/>
+        </w:rPr>
+        <w:t>:</w:t>
+      </w:r>
+      <w:r>
+        <w:rPr>
+          <w:rFonts w:ascii="Barlow" w:hAnsi="Barlow"/>
+          <w:sz w:val="22"/>
+          <w:szCs w:val="22"/>
+        </w:rPr>
+        <w:tab/>
+      </w:r>
+      <w:r>
+        <w:rPr>
+          <w:rFonts w:ascii="Barlow" w:hAnsi="Barlow"/>
+          <w:b/>
+          <w:bCs/>
+          <w:sz w:val="22"/>
+          <w:szCs w:val="22"/>
+        </w:rPr>
+        <w:t>[ACCIONANTE]</w:t>
+      </w:r>
+    </w:p>
+    <w:p>
+      <w:pPr>
+        <w:ind w:left="1985" w:hanging="1701"/>
+        <w:jc w:val="both"/>
+        <w:rPr>
+          <w:rFonts w:ascii="Barlow" w:eastAsia="Barlow" w:hAnsi="Barlow" w:cs="Barlow"/>
+          <w:color w:val="000000" w:themeColor="text1"/>
+          <w:sz w:val="22"/>
+          <w:szCs w:val="22"/>
+        </w:rPr>
+      </w:pPr>
+      <w:r>
+        <w:rPr>
+          <w:rFonts w:ascii="Barlow" w:eastAsia="Barlow" w:hAnsi="Barlow" w:cs="Barlow"/>
+          <w:b/>
+          <w:bCs/>
+          <w:color w:val="000000" w:themeColor="text1"/>
+          <w:sz w:val="22"/>
+          <w:szCs w:val="22"/>
+          <w:lang w:val="es-ES"/>
+        </w:rPr>
+        <w:t>Accionado:</w:t>
+      </w:r>
+      <w:r>
+        <w:rPr>
+          <w:rFonts w:ascii="Barlow" w:hAnsi="Barlow"/>
+          <w:sz w:val="22"/>
+          <w:szCs w:val="22"/>
+        </w:rPr>
+        <w:tab/>
+      </w:r>
+      <w:r>
+        <w:rPr>
+          <w:rFonts w:ascii="Barlow" w:eastAsia="Barlow" w:hAnsi="Barlow" w:cs="Barlow"/>
+          <w:color w:val="000000" w:themeColor="text1"/>
+          <w:sz w:val="22"/>
+          <w:szCs w:val="22"/>
+          <w:lang w:val="es-ES"/>
+        </w:rPr>
+        <w:t xml:space="preserve">EPS SURA - 8000887022 </w:t>
+      </w:r>
+    </w:p>
+    <w:p>
+      <w:pPr>
+        <w:ind w:left="1985" w:hanging="1701"/>
+        <w:jc w:val="both"/>
+        <w:rPr>
+          <w:rFonts w:ascii="Barlow" w:eastAsia="Barlow" w:hAnsi="Barlow" w:cs="Barlow"/>
+          <w:color w:val="000000" w:themeColor="text1"/>
+          <w:sz w:val="22"/>
+          <w:szCs w:val="22"/>
+        </w:rPr>
+      </w:pPr>
+      <w:r>
+        <w:rPr>
+          <w:rFonts w:ascii="Barlow" w:eastAsia="Barlow" w:hAnsi="Barlow" w:cs="Barlow"/>
+          <w:b/>
+          <w:bCs/>
+          <w:color w:val="000000" w:themeColor="text1"/>
+          <w:sz w:val="22"/>
+          <w:szCs w:val="22"/>
+          <w:lang w:val="es-ES"/>
+        </w:rPr>
         <w:t>Radicado:</w:t>
       </w:r>
       <w:r>
@@ -420,6 +430,8 @@
       <w:r>
         <w:rPr>
           <w:rFonts w:ascii="Barlow" w:hAnsi="Barlow"/>
+          <w:b/>
+          <w:bCs/>
           <w:sz w:val="22"/>
           <w:szCs w:val="22"/>
         </w:rPr>
@@ -472,16 +484,16 @@
           <w:sz w:val="22"/>
           <w:szCs w:val="22"/>
         </w:rPr>
-        <w:t>[REPRESENTANTE LEGAL Y CC]</w:t>
-      </w:r>
-      <w:r>
-        <w:rPr>
-          <w:rFonts w:ascii="Barlow" w:eastAsia="Barlow" w:hAnsi="Barlow" w:cs="Barlow"/>
-          <w:color w:val="000000" w:themeColor="text1"/>
-          <w:sz w:val="22"/>
-          <w:szCs w:val="22"/>
-        </w:rPr>
-        <w:t xml:space="preserve"> obrando en mi condición de Representante Legal de la compañía </w:t>
+        <w:t>[REPRESENTANTE_LEGAL] CC [CEDULA_REPRESENTANTE]</w:t>
+      </w:r>
+      <w:r>
+        <w:rPr>
+          <w:rFonts w:ascii="Barlow" w:eastAsia="Barlow" w:hAnsi="Barlow" w:cs="Barlow"/>
+          <w:color w:val="000000" w:themeColor="text1"/>
+          <w:sz w:val="22"/>
+          <w:szCs w:val="22"/>
+        </w:rPr>
+        <w:t xml:space="preserve"> obrando en mi condición de Representante Legal de la compañía EPS SURAMERICANA S.A</w:t>
       </w:r>
       <w:r>
         <w:rPr>
@@ -491,10 +503,29 @@
           <w:color w:val="000000" w:themeColor="text1"/>
           <w:sz w:val="22"/>
           <w:szCs w:val="22"/>
-          <w:lang w:val="es-ES"/>
-        </w:rPr>
-        <w:t>EPS SURAMERICANA S.A. NIT800.088.702-2 - EPS SURAMERICANA S.A.</w:t>
-      </w:r>
+        </w:rPr>
+        <w:t>. NIT800.088.702-2 - EPS SURAMERICANA S.A.</w:t>
+      </w:r>
+      <w:r>
+        <w:rPr>
+          <w:rFonts w:ascii="Barlow" w:eastAsia="Barlow" w:hAnsi="Barlow" w:cs="Barlow"/>
+          <w:color w:val="000000" w:themeColor="text1"/>
+          <w:sz w:val="22"/>
+          <w:szCs w:val="22"/>
+        </w:rPr>
+        <w:t>, en adelante SURA, tal como consta en el certificado de existencia y representación legal que se adjunta al presente escrito, respetuosamente doy contestación dentro del término judicial señalado a la acción de tutela interpuesta por la parte accionante, de la siguiente manera:</w:t>
+      </w:r>
+    </w:p>
+    <w:p>
+      <w:pPr>
+        <w:jc w:val="center"/>
+        <w:rPr>
+          <w:rFonts w:ascii="Barlow" w:eastAsia="Barlow" w:hAnsi="Barlow" w:cs="Barlow"/>
+          <w:color w:val="000000" w:themeColor="text1"/>
+          <w:sz w:val="22"/>
+          <w:szCs w:val="22"/>
+        </w:rPr>
+      </w:pPr>
       <w:r>
         <w:rPr>
           <w:rFonts w:ascii="Barlow" w:eastAsia="Barlow" w:hAnsi="Barlow" w:cs="Barlow"/>
@@ -503,96 +534,74 @@
           <w:color w:val="000000" w:themeColor="text1"/>
           <w:sz w:val="22"/>
           <w:szCs w:val="22"/>
-        </w:rPr>
-        <w:t xml:space="preserve">, </w:t>
-      </w:r>
-      <w:r>
-        <w:rPr>
-          <w:rFonts w:ascii="Barlow" w:eastAsia="Barlow" w:hAnsi="Barlow" w:cs="Barlow"/>
-          <w:color w:val="000000" w:themeColor="text1"/>
-          <w:sz w:val="22"/>
-          <w:szCs w:val="22"/>
-        </w:rPr>
-        <w:t xml:space="preserve">en adelante </w:t>
-      </w:r>
-      <w:r>
-        <w:rPr>
-          <w:rFonts w:ascii="Barlow" w:eastAsia="Barlow" w:hAnsi="Barlow" w:cs="Barlow"/>
-          <w:b/>
-          <w:bCs/>
-          <w:color w:val="000000" w:themeColor="text1"/>
-          <w:sz w:val="22"/>
-          <w:szCs w:val="22"/>
-        </w:rPr>
-        <w:t>SURA,</w:t>
-      </w:r>
-      <w:r>
-        <w:rPr>
-          <w:rFonts w:ascii="Barlow" w:eastAsia="Barlow" w:hAnsi="Barlow" w:cs="Barlow"/>
-          <w:color w:val="000000" w:themeColor="text1"/>
-          <w:sz w:val="22"/>
-          <w:szCs w:val="22"/>
-        </w:rPr>
-        <w:t xml:space="preserve"> tal como consta en el certificado de existencia y representación legal que se adjunta al presente escrito, respetuosamente doy </w:t>
-      </w:r>
-      <w:r>
-        <w:rPr>
-          <w:rFonts w:ascii="Barlow" w:eastAsia="Barlow" w:hAnsi="Barlow" w:cs="Barlow"/>
-          <w:b/>
-          <w:bCs/>
-          <w:color w:val="000000" w:themeColor="text1"/>
-          <w:sz w:val="22"/>
-          <w:szCs w:val="22"/>
-        </w:rPr>
-        <w:t>contestación</w:t>
-      </w:r>
-      <w:r>
-        <w:rPr>
-          <w:rFonts w:ascii="Barlow" w:eastAsia="Barlow" w:hAnsi="Barlow" w:cs="Barlow"/>
-          <w:color w:val="000000" w:themeColor="text1"/>
-          <w:sz w:val="22"/>
-          <w:szCs w:val="22"/>
-        </w:rPr>
-        <w:t xml:space="preserve"> dentro del término judicial señalado a la acción de tutela interpuesta por la parte accionante, de la siguiente manera:</w:t>
-      </w:r>
-    </w:p>
-    <w:p>
-      <w:pPr>
-        <w:tabs>
-          <w:tab w:val="left" w:pos="8273"/>
-        </w:tabs>
-        <w:ind w:right="49"/>
-        <w:jc w:val="both"/>
-        <w:rPr>
-          <w:rFonts w:ascii="Barlow" w:eastAsia="Barlow" w:hAnsi="Barlow" w:cs="Barlow"/>
-          <w:color w:val="000000" w:themeColor="text1"/>
-          <w:sz w:val="22"/>
-          <w:szCs w:val="22"/>
-        </w:rPr>
-      </w:pPr>
-    </w:p>
-    <w:p>
-      <w:pPr>
-        <w:jc w:val="center"/>
-        <w:rPr>
-          <w:rFonts w:ascii="Barlow" w:eastAsia="Barlow" w:hAnsi="Barlow" w:cs="Barlow"/>
-          <w:color w:val="000000" w:themeColor="text1"/>
-          <w:sz w:val="22"/>
-          <w:szCs w:val="22"/>
-        </w:rPr>
-      </w:pPr>
-      <w:r>
-        <w:rPr>
-          <w:rFonts w:ascii="Barlow" w:eastAsia="Barlow" w:hAnsi="Barlow" w:cs="Barlow"/>
-          <w:b/>
-          <w:bCs/>
-          <w:color w:val="000000" w:themeColor="text1"/>
-          <w:sz w:val="22"/>
-          <w:szCs w:val="22"/>
           <w:lang w:val="es-ES"/>
         </w:rPr>
         <w:t>A LOS HECHOS</w:t>
       </w:r>
+    </w:p>
+    <w:p>
+      <w:pPr>
+        <w:jc w:val="both"/>
+        <w:rPr>
+          <w:rFonts w:ascii="Barlow" w:eastAsia="Barlow" w:hAnsi="Barlow" w:cs="Barlow"/>
+          <w:color w:val="000000" w:themeColor="text1"/>
+          <w:sz w:val="22"/>
+          <w:szCs w:val="22"/>
+        </w:rPr>
+      </w:pPr>
+    </w:p>
+    <w:p>
+      <w:pPr>
+        <w:jc w:val="both"/>
+        <w:rPr>
+          <w:rFonts w:ascii="Barlow" w:eastAsia="Barlow" w:hAnsi="Barlow" w:cs="Barlow"/>
+          <w:color w:val="000000" w:themeColor="text1"/>
+          <w:sz w:val="22"/>
+          <w:szCs w:val="22"/>
+        </w:rPr>
+      </w:pPr>
+    </w:p>
+    <w:p>
+      <w:pPr>
+        <w:jc w:val="both"/>
+        <w:rPr>
+          <w:rFonts w:ascii="Barlow" w:eastAsia="Barlow" w:hAnsi="Barlow" w:cs="Barlow"/>
+          <w:color w:val="000000" w:themeColor="text1"/>
+          <w:sz w:val="22"/>
+          <w:szCs w:val="22"/>
+        </w:rPr>
+      </w:pPr>
+    </w:p>
+    <w:p>
+      <w:pPr>
+        <w:jc w:val="both"/>
+        <w:rPr>
+          <w:rFonts w:ascii="Barlow" w:eastAsia="Barlow" w:hAnsi="Barlow" w:cs="Barlow"/>
+          <w:color w:val="000000" w:themeColor="text1"/>
+          <w:sz w:val="22"/>
+          <w:szCs w:val="22"/>
+        </w:rPr>
+      </w:pPr>
+      <w:r>
+        <w:rPr>
+          <w:rFonts w:ascii="Barlow" w:eastAsia="Barlow" w:hAnsi="Barlow" w:cs="Barlow"/>
+          <w:color w:val="000000" w:themeColor="text1"/>
+          <w:sz w:val="22"/>
+          <w:szCs w:val="22"/>
+        </w:rPr>
+        <w:t>[CONCEPTO TECNICO]</w:t>
+      </w:r>
+    </w:p>
+    <w:p>
+      <w:pPr>
+        <w:jc w:val="both"/>
+        <w:rPr>
+          <w:rFonts w:ascii="Barlow" w:eastAsia="Barlow" w:hAnsi="Barlow" w:cs="Barlow"/>
+          <w:color w:val="000000" w:themeColor="text1"/>
+          <w:sz w:val="22"/>
+          <w:szCs w:val="22"/>
+        </w:rPr>
+      </w:pPr>
     </w:p>
     <w:p>
       <w:pPr>
@@ -879,7 +888,18 @@
           <w:szCs w:val="22"/>
           <w:lang w:val="es-ES"/>
         </w:rPr>
-        <w:t>, que haya violado, viole o amenace violar cualquiera de los derechos de que trata el artículo 2o. de esta ley. También procede contra acciones u omisiones de particulares, de conformidad con lo establecido en el Capítulo III de este Decreto. La procedencia de la tutela en ningún caso está sujeta a que la acción de la autoridad o del particular se haya manifestado en un acto jurídico escrito</w:t>
+        <w:t xml:space="preserve">, que haya violado, viole o amenace violar cualquiera de los derechos de que trata el artículo 2o. de esta ley. También procede contra </w:t>
+      </w:r>
+      <w:r>
+        <w:rPr>
+          <w:rFonts w:ascii="Barlow" w:eastAsia="Barlow" w:hAnsi="Barlow" w:cs="Barlow"/>
+          <w:color w:val="000000" w:themeColor="text1"/>
+          <w:sz w:val="22"/>
+          <w:szCs w:val="22"/>
+          <w:lang w:val="es-ES"/>
+        </w:rPr>
+        <w:lastRenderedPageBreak/>
+        <w:t>acciones u omisiones de particulares, de conformidad con lo establecido en el Capítulo III de este Decreto. La procedencia de la tutela en ningún caso está sujeta a que la acción de la autoridad o del particular se haya manifestado en un acto jurídico escrito</w:t>
       </w:r>
       <w:r>
         <w:rPr>
@@ -935,7 +955,6 @@
           <w:u w:val="single"/>
           <w:lang w:val="es-ES"/>
         </w:rPr>
-        <w:lastRenderedPageBreak/>
         <w:t>IMPROCEDENCIA DE LA ACCIÓN DE TUTELA POR INEXISTENCIA DE VIOLACIÓN A DERECHO FUNDAMENTAL ALGUNO DEL ACCIONANTE</w:t>
       </w:r>
     </w:p>
@@ -1324,18 +1343,7 @@
           <w:szCs w:val="22"/>
           <w:lang w:val="es-ES"/>
         </w:rPr>
-        <w:t xml:space="preserve"> no ha vulnerado ningún derecho fundamental al accionante en el caso expuesto, toda vez que se ha </w:t>
-      </w:r>
-      <w:r>
-        <w:rPr>
-          <w:rFonts w:ascii="Barlow" w:eastAsia="Barlow" w:hAnsi="Barlow" w:cs="Barlow"/>
-          <w:color w:val="000000" w:themeColor="text1"/>
-          <w:sz w:val="22"/>
-          <w:szCs w:val="22"/>
-          <w:lang w:val="es-ES"/>
-        </w:rPr>
-        <w:lastRenderedPageBreak/>
-        <w:t>apegado a los derechos y deberes establecidos por la ley, pues frente a los argumentos expuestos no se observa culpa alguna frente a la situación de aquel.</w:t>
+        <w:t xml:space="preserve"> no ha vulnerado ningún derecho fundamental al accionante en el caso expuesto, toda vez que se ha apegado a los derechos y deberes establecidos por la ley, pues frente a los argumentos expuestos no se observa culpa alguna frente a la situación de aquel.</w:t>
       </w:r>
     </w:p>
     <w:p>
@@ -1594,17 +1602,15 @@
         </w:rPr>
         <w:t xml:space="preserve">Memorial informativo estructura EPS SURAMERICANA </w:t>
       </w:r>
-      <w:proofErr w:type="gramStart"/>
-      <w:r>
-        <w:rPr>
-          <w:rFonts w:ascii="Barlow" w:eastAsia="Barlow" w:hAnsi="Barlow" w:cs="Barlow"/>
-          <w:sz w:val="22"/>
-          <w:szCs w:val="22"/>
-          <w:lang w:val="es-ES"/>
-        </w:rPr>
-        <w:t>S.A..</w:t>
-      </w:r>
-      <w:proofErr w:type="gramEnd"/>
+      <w:r>
+        <w:rPr>
+          <w:rFonts w:ascii="Barlow" w:eastAsia="Barlow" w:hAnsi="Barlow" w:cs="Barlow"/>
+          <w:sz w:val="22"/>
+          <w:szCs w:val="22"/>
+          <w:lang w:val="es-ES"/>
+        </w:rPr>
+        <w:t>S.A.</w:t>
+      </w:r>
     </w:p>
     <w:p>
       <w:pPr>
@@ -1695,39 +1701,6 @@
           <w:szCs w:val="22"/>
         </w:rPr>
       </w:pPr>
-    </w:p>
-    <w:p>
-      <w:pPr>
-        <w:jc w:val="both"/>
-        <w:rPr>
-          <w:rFonts w:ascii="Barlow" w:eastAsia="Barlow" w:hAnsi="Barlow" w:cs="Barlow"/>
-          <w:color w:val="000000" w:themeColor="text1"/>
-          <w:sz w:val="22"/>
-          <w:szCs w:val="22"/>
-        </w:rPr>
-      </w:pPr>
-    </w:p>
-    <w:p>
-      <w:pPr>
-        <w:jc w:val="both"/>
-        <w:rPr>
-          <w:rFonts w:ascii="Barlow" w:eastAsia="Barlow" w:hAnsi="Barlow" w:cs="Barlow"/>
-          <w:color w:val="000000" w:themeColor="text1"/>
-          <w:sz w:val="22"/>
-          <w:szCs w:val="22"/>
-        </w:rPr>
-      </w:pPr>
-    </w:p>
-    <w:p>
-      <w:pPr>
-        <w:jc w:val="both"/>
-        <w:rPr>
-          <w:rFonts w:ascii="Barlow" w:eastAsia="Barlow" w:hAnsi="Barlow" w:cs="Barlow"/>
-          <w:color w:val="000000" w:themeColor="text1"/>
-          <w:sz w:val="22"/>
-          <w:szCs w:val="22"/>
-        </w:rPr>
-      </w:pPr>
       <w:r>
         <w:rPr>
           <w:rFonts w:ascii="Barlow" w:eastAsia="Barlow" w:hAnsi="Barlow" w:cs="Barlow"/>
@@ -1788,7 +1761,7 @@
           <w:sz w:val="22"/>
           <w:szCs w:val="22"/>
         </w:rPr>
-        <w:t>[REPRESENTANTE LEGAL Y CC]</w:t>
+        <w:t xml:space="preserve">[REPRESENTANTE_LEGAL] CC [CEDULA_REPRESENTANTE] </w:t>
       </w:r>
     </w:p>
     <w:p>
@@ -1904,6 +1877,87 @@
           <w:lang w:val="es-ES"/>
         </w:rPr>
       </w:pPr>
+    </w:p>
+    <w:p>
+      <w:pPr>
+        <w:jc w:val="both"/>
+        <w:rPr>
+          <w:rFonts w:ascii="Barlow" w:eastAsia="Barlow" w:hAnsi="Barlow" w:cs="Barlow"/>
+          <w:color w:val="000000" w:themeColor="text1"/>
+          <w:sz w:val="22"/>
+          <w:szCs w:val="22"/>
+          <w:lang w:val="es-ES"/>
+        </w:rPr>
+      </w:pPr>
+    </w:p>
+    <w:p>
+      <w:pPr>
+        <w:jc w:val="both"/>
+        <w:rPr>
+          <w:rFonts w:ascii="Barlow" w:eastAsia="Barlow" w:hAnsi="Barlow" w:cs="Barlow"/>
+          <w:color w:val="000000" w:themeColor="text1"/>
+          <w:sz w:val="22"/>
+          <w:szCs w:val="22"/>
+          <w:lang w:val="es-ES"/>
+        </w:rPr>
+      </w:pPr>
+    </w:p>
+    <w:p>
+      <w:pPr>
+        <w:jc w:val="both"/>
+        <w:rPr>
+          <w:rFonts w:ascii="Barlow" w:eastAsia="Barlow" w:hAnsi="Barlow" w:cs="Barlow"/>
+          <w:color w:val="000000" w:themeColor="text1"/>
+          <w:sz w:val="22"/>
+          <w:szCs w:val="22"/>
+          <w:lang w:val="es-ES"/>
+        </w:rPr>
+      </w:pPr>
+    </w:p>
+    <w:p>
+      <w:pPr>
+        <w:jc w:val="both"/>
+        <w:rPr>
+          <w:rFonts w:ascii="Barlow" w:eastAsia="Barlow" w:hAnsi="Barlow" w:cs="Barlow"/>
+          <w:color w:val="000000" w:themeColor="text1"/>
+          <w:sz w:val="22"/>
+          <w:szCs w:val="22"/>
+          <w:lang w:val="es-ES"/>
+        </w:rPr>
+      </w:pPr>
+    </w:p>
+    <w:p>
+      <w:pPr>
+        <w:jc w:val="both"/>
+        <w:rPr>
+          <w:rFonts w:ascii="Barlow" w:eastAsia="Barlow" w:hAnsi="Barlow" w:cs="Barlow"/>
+          <w:color w:val="000000" w:themeColor="text1"/>
+          <w:sz w:val="22"/>
+          <w:szCs w:val="22"/>
+          <w:lang w:val="es-ES"/>
+        </w:rPr>
+      </w:pPr>
+    </w:p>
+    <w:p>
+      <w:pPr>
+        <w:jc w:val="both"/>
+        <w:rPr>
+          <w:rFonts w:ascii="Barlow" w:eastAsia="Barlow" w:hAnsi="Barlow" w:cs="Barlow"/>
+          <w:color w:val="000000" w:themeColor="text1"/>
+          <w:sz w:val="22"/>
+          <w:szCs w:val="22"/>
+        </w:rPr>
+      </w:pPr>
+      <w:r>
+        <w:rPr>
+          <w:rFonts w:ascii="Barlow" w:eastAsia="Barlow" w:hAnsi="Barlow" w:cs="Barlow"/>
+          <w:color w:val="000000" w:themeColor="text1"/>
+          <w:sz w:val="22"/>
+          <w:szCs w:val="22"/>
+        </w:rPr>
+        <w:lastRenderedPageBreak/>
+        <w:t>[FECHA_CONTESTACION]</w:t>
+      </w:r>
     </w:p>
     <w:p>
       <w:pPr>
@@ -2021,7 +2075,6 @@
           <w:szCs w:val="22"/>
           <w:lang w:val="es-ES"/>
         </w:rPr>
-        <w:lastRenderedPageBreak/>
         <w:t>E.</w:t>
       </w:r>
       <w:r>
@@ -4270,6 +4323,7 @@
                 <w:szCs w:val="22"/>
                 <w:lang w:val="es-ES"/>
               </w:rPr>
+              <w:lastRenderedPageBreak/>
               <w:t>Casanare</w:t>
             </w:r>
           </w:p>
@@ -4438,7 +4492,6 @@
                 <w:szCs w:val="22"/>
                 <w:lang w:val="es-ES"/>
               </w:rPr>
-              <w:lastRenderedPageBreak/>
               <w:t>El Dobio</w:t>
             </w:r>
             <w:r>
@@ -4587,7 +4640,6 @@
                 <w:szCs w:val="22"/>
                 <w:lang w:val="es-ES"/>
               </w:rPr>
-              <w:lastRenderedPageBreak/>
               <w:t>Sucre</w:t>
             </w:r>
           </w:p>
@@ -6709,7 +6761,6 @@
   <w:style w:type="character" w:default="1" w:styleId="Fuentedeprrafopredeter">
     <w:name w:val="Default Paragraph Font"/>
     <w:uiPriority w:val="1"/>
-    <w:semiHidden/>
     <w:unhideWhenUsed/>
   </w:style>
   <w:style w:type="table" w:default="1" w:styleId="Tablanormal">

</xml_diff>